<commit_message>
Changed testing document as well as added the add deck function, need to test.
</commit_message>
<xml_diff>
--- a/Testing for 91906.docx
+++ b/Testing for 91906.docx
@@ -10,20 +10,21 @@
     <w:tbl>
       <w:tblPr>
         <w:tblStyle w:val="TableGrid"/>
-        <w:tblW w:w="0" w:type="auto"/>
+        <w:tblW w:w="11482" w:type="dxa"/>
+        <w:tblInd w:w="-1139" w:type="dxa"/>
         <w:tblLook w:val="04A0" w:firstRow="1" w:lastRow="0" w:firstColumn="1" w:lastColumn="0" w:noHBand="0" w:noVBand="1"/>
       </w:tblPr>
       <w:tblGrid>
-        <w:gridCol w:w="1803"/>
-        <w:gridCol w:w="1803"/>
-        <w:gridCol w:w="1803"/>
-        <w:gridCol w:w="1803"/>
-        <w:gridCol w:w="1804"/>
+        <w:gridCol w:w="1985"/>
+        <w:gridCol w:w="992"/>
+        <w:gridCol w:w="1419"/>
+        <w:gridCol w:w="4575"/>
+        <w:gridCol w:w="2511"/>
       </w:tblGrid>
       <w:tr>
         <w:tc>
           <w:tcPr>
-            <w:tcW w:w="1803" w:type="dxa"/>
+            <w:tcW w:w="1985" w:type="dxa"/>
             <w:tcBorders>
               <w:bottom w:val="single" w:sz="12" w:space="0" w:color="auto"/>
             </w:tcBorders>
@@ -36,7 +37,7 @@
         </w:tc>
         <w:tc>
           <w:tcPr>
-            <w:tcW w:w="1803" w:type="dxa"/>
+            <w:tcW w:w="992" w:type="dxa"/>
             <w:tcBorders>
               <w:bottom w:val="single" w:sz="12" w:space="0" w:color="auto"/>
             </w:tcBorders>
@@ -49,7 +50,7 @@
         </w:tc>
         <w:tc>
           <w:tcPr>
-            <w:tcW w:w="1803" w:type="dxa"/>
+            <w:tcW w:w="1419" w:type="dxa"/>
             <w:tcBorders>
               <w:bottom w:val="single" w:sz="12" w:space="0" w:color="auto"/>
             </w:tcBorders>
@@ -62,7 +63,7 @@
         </w:tc>
         <w:tc>
           <w:tcPr>
-            <w:tcW w:w="1803" w:type="dxa"/>
+            <w:tcW w:w="4575" w:type="dxa"/>
             <w:tcBorders>
               <w:bottom w:val="single" w:sz="12" w:space="0" w:color="auto"/>
             </w:tcBorders>
@@ -75,7 +76,7 @@
         </w:tc>
         <w:tc>
           <w:tcPr>
-            <w:tcW w:w="1804" w:type="dxa"/>
+            <w:tcW w:w="2511" w:type="dxa"/>
             <w:tcBorders>
               <w:bottom w:val="single" w:sz="12" w:space="0" w:color="auto"/>
             </w:tcBorders>
@@ -90,110 +91,196 @@
       <w:tr>
         <w:tc>
           <w:tcPr>
-            <w:tcW w:w="1803" w:type="dxa"/>
+            <w:tcW w:w="1985" w:type="dxa"/>
             <w:tcBorders>
               <w:top w:val="single" w:sz="12" w:space="0" w:color="auto"/>
             </w:tcBorders>
           </w:tcPr>
-          <w:p/>
-        </w:tc>
-        <w:tc>
-          <w:tcPr>
-            <w:tcW w:w="1803" w:type="dxa"/>
+          <w:p>
+            <w:r>
+              <w:t>Whether my db file is created upon lauching code</w:t>
+            </w:r>
+          </w:p>
+        </w:tc>
+        <w:tc>
+          <w:tcPr>
+            <w:tcW w:w="992" w:type="dxa"/>
             <w:tcBorders>
               <w:top w:val="single" w:sz="12" w:space="0" w:color="auto"/>
             </w:tcBorders>
           </w:tcPr>
-          <w:p/>
-        </w:tc>
-        <w:tc>
-          <w:tcPr>
-            <w:tcW w:w="1803" w:type="dxa"/>
+          <w:p>
+            <w:r>
+              <w:t>valid</w:t>
+            </w:r>
+          </w:p>
+        </w:tc>
+        <w:tc>
+          <w:tcPr>
+            <w:tcW w:w="1419" w:type="dxa"/>
             <w:tcBorders>
               <w:top w:val="single" w:sz="12" w:space="0" w:color="auto"/>
             </w:tcBorders>
           </w:tcPr>
-          <w:p/>
-        </w:tc>
-        <w:tc>
-          <w:tcPr>
-            <w:tcW w:w="1803" w:type="dxa"/>
+          <w:p>
+            <w:r>
+              <w:t>That a db file is created with two tables within it</w:t>
+            </w:r>
+          </w:p>
+        </w:tc>
+        <w:tc>
+          <w:tcPr>
+            <w:tcW w:w="4575" w:type="dxa"/>
             <w:tcBorders>
               <w:top w:val="single" w:sz="12" w:space="0" w:color="auto"/>
             </w:tcBorders>
           </w:tcPr>
-          <w:p/>
-        </w:tc>
-        <w:tc>
-          <w:tcPr>
-            <w:tcW w:w="1804" w:type="dxa"/>
+          <w:p>
+            <w:r>
+              <w:t>Error code</w:t>
+            </w:r>
+          </w:p>
+          <w:p>
+            <w:r>
+              <w:t>cur.execute("""</w:t>
+            </w:r>
+          </w:p>
+          <w:p>
+            <w:r>
+              <w:t xml:space="preserve">    ~~~~~~~~~~~^^^^</w:t>
+            </w:r>
+          </w:p>
+          <w:p>
+            <w:r>
+              <w:t xml:space="preserve">        CREATE TABLE IF NOT EXISTS decks (</w:t>
+            </w:r>
+          </w:p>
+          <w:p>
+            <w:r>
+              <w:t xml:space="preserve">        ^^^^^^^^^^^^^^^^^^^^^^^^^^^^^^^^^^</w:t>
+            </w:r>
+          </w:p>
+          <w:p>
+            <w:r>
+              <w:t xml:space="preserve">    ...&lt;2 lines&gt;...</w:t>
+            </w:r>
+          </w:p>
+          <w:p>
+            <w:r>
+              <w:t xml:space="preserve">        )</w:t>
+            </w:r>
+          </w:p>
+          <w:p>
+            <w:r>
+              <w:t xml:space="preserve">        ^</w:t>
+            </w:r>
+          </w:p>
+          <w:p>
+            <w:r>
+              <w:t xml:space="preserve">    """)</w:t>
+            </w:r>
+          </w:p>
+        </w:tc>
+        <w:tc>
+          <w:tcPr>
+            <w:tcW w:w="2511" w:type="dxa"/>
             <w:tcBorders>
               <w:top w:val="single" w:sz="12" w:space="0" w:color="auto"/>
             </w:tcBorders>
           </w:tcPr>
-          <w:p/>
+          <w:p>
+            <w:r>
+              <w:t>Used AI to explain error code. Solution was that I needed to check my spelling and wording of the primary key INTEGER PRIMARY KEY AUTOINCREMENT</w:t>
+            </w:r>
+          </w:p>
         </w:tc>
       </w:tr>
       <w:tr>
         <w:tc>
           <w:tcPr>
-            <w:tcW w:w="1803" w:type="dxa"/>
-          </w:tcPr>
-          <w:p/>
-        </w:tc>
-        <w:tc>
-          <w:tcPr>
-            <w:tcW w:w="1803" w:type="dxa"/>
-          </w:tcPr>
-          <w:p/>
-        </w:tc>
-        <w:tc>
-          <w:tcPr>
-            <w:tcW w:w="1803" w:type="dxa"/>
-          </w:tcPr>
-          <w:p/>
-        </w:tc>
-        <w:tc>
-          <w:tcPr>
-            <w:tcW w:w="1803" w:type="dxa"/>
-          </w:tcPr>
-          <w:p/>
-        </w:tc>
-        <w:tc>
-          <w:tcPr>
-            <w:tcW w:w="1804" w:type="dxa"/>
-          </w:tcPr>
-          <w:p/>
+            <w:tcW w:w="1985" w:type="dxa"/>
+          </w:tcPr>
+          <w:p>
+            <w:r>
+              <w:t>When relaunching my code, no duplicates or crashed should occur</w:t>
+            </w:r>
+          </w:p>
+        </w:tc>
+        <w:tc>
+          <w:tcPr>
+            <w:tcW w:w="992" w:type="dxa"/>
+          </w:tcPr>
+          <w:p>
+            <w:r>
+              <w:t>valid</w:t>
+            </w:r>
+          </w:p>
+        </w:tc>
+        <w:tc>
+          <w:tcPr>
+            <w:tcW w:w="1419" w:type="dxa"/>
+          </w:tcPr>
+          <w:p>
+            <w:r>
+              <w:t>That nothing happens and the  database remains created</w:t>
+            </w:r>
+          </w:p>
+        </w:tc>
+        <w:tc>
+          <w:tcPr>
+            <w:tcW w:w="4575" w:type="dxa"/>
+          </w:tcPr>
+          <w:p>
+            <w:r>
+              <w:t>A duplicate of the tables were created and the program crashed</w:t>
+            </w:r>
+          </w:p>
+        </w:tc>
+        <w:tc>
+          <w:tcPr>
+            <w:tcW w:w="2511" w:type="dxa"/>
+          </w:tcPr>
+          <w:p>
+            <w:r>
+              <w:t>Needed to include in the create table statement IF NOT EXIST which therefore means that it only does the creation process if the table isn’t already in exist</w:t>
+            </w:r>
+            <w:r>
+              <w:t>e</w:t>
+            </w:r>
+            <w:r>
+              <w:t>nce</w:t>
+            </w:r>
+          </w:p>
         </w:tc>
       </w:tr>
       <w:tr>
         <w:tc>
           <w:tcPr>
-            <w:tcW w:w="1803" w:type="dxa"/>
+            <w:tcW w:w="1985" w:type="dxa"/>
           </w:tcPr>
           <w:p/>
         </w:tc>
         <w:tc>
           <w:tcPr>
-            <w:tcW w:w="1803" w:type="dxa"/>
+            <w:tcW w:w="992" w:type="dxa"/>
           </w:tcPr>
           <w:p/>
         </w:tc>
         <w:tc>
           <w:tcPr>
-            <w:tcW w:w="1803" w:type="dxa"/>
+            <w:tcW w:w="1419" w:type="dxa"/>
           </w:tcPr>
           <w:p/>
         </w:tc>
         <w:tc>
           <w:tcPr>
-            <w:tcW w:w="1803" w:type="dxa"/>
+            <w:tcW w:w="4575" w:type="dxa"/>
           </w:tcPr>
           <w:p/>
         </w:tc>
         <w:tc>
           <w:tcPr>
-            <w:tcW w:w="1804" w:type="dxa"/>
+            <w:tcW w:w="2511" w:type="dxa"/>
           </w:tcPr>
           <w:p/>
         </w:tc>
@@ -201,31 +288,31 @@
       <w:tr>
         <w:tc>
           <w:tcPr>
-            <w:tcW w:w="1803" w:type="dxa"/>
+            <w:tcW w:w="1985" w:type="dxa"/>
           </w:tcPr>
           <w:p/>
         </w:tc>
         <w:tc>
           <w:tcPr>
-            <w:tcW w:w="1803" w:type="dxa"/>
+            <w:tcW w:w="992" w:type="dxa"/>
           </w:tcPr>
           <w:p/>
         </w:tc>
         <w:tc>
           <w:tcPr>
-            <w:tcW w:w="1803" w:type="dxa"/>
+            <w:tcW w:w="1419" w:type="dxa"/>
           </w:tcPr>
           <w:p/>
         </w:tc>
         <w:tc>
           <w:tcPr>
-            <w:tcW w:w="1803" w:type="dxa"/>
+            <w:tcW w:w="4575" w:type="dxa"/>
           </w:tcPr>
           <w:p/>
         </w:tc>
         <w:tc>
           <w:tcPr>
-            <w:tcW w:w="1804" w:type="dxa"/>
+            <w:tcW w:w="2511" w:type="dxa"/>
           </w:tcPr>
           <w:p/>
         </w:tc>
@@ -233,31 +320,31 @@
       <w:tr>
         <w:tc>
           <w:tcPr>
-            <w:tcW w:w="1803" w:type="dxa"/>
+            <w:tcW w:w="1985" w:type="dxa"/>
           </w:tcPr>
           <w:p/>
         </w:tc>
         <w:tc>
           <w:tcPr>
-            <w:tcW w:w="1803" w:type="dxa"/>
+            <w:tcW w:w="992" w:type="dxa"/>
           </w:tcPr>
           <w:p/>
         </w:tc>
         <w:tc>
           <w:tcPr>
-            <w:tcW w:w="1803" w:type="dxa"/>
+            <w:tcW w:w="1419" w:type="dxa"/>
           </w:tcPr>
           <w:p/>
         </w:tc>
         <w:tc>
           <w:tcPr>
-            <w:tcW w:w="1803" w:type="dxa"/>
+            <w:tcW w:w="4575" w:type="dxa"/>
           </w:tcPr>
           <w:p/>
         </w:tc>
         <w:tc>
           <w:tcPr>
-            <w:tcW w:w="1804" w:type="dxa"/>
+            <w:tcW w:w="2511" w:type="dxa"/>
           </w:tcPr>
           <w:p/>
         </w:tc>
@@ -1529,6 +1616,23 @@
 </file>
 
 <file path=customXml/item1.xml><?xml version="1.0" encoding="utf-8"?>
+<p:properties xmlns:p="http://schemas.microsoft.com/office/2006/metadata/properties" xmlns:xsi="http://www.w3.org/2001/XMLSchema-instance" xmlns:pc="http://schemas.microsoft.com/office/infopath/2007/PartnerControls">
+  <documentManagement>
+    <_activity xmlns="425edb08-f8b6-435f-9340-f90897a0812f" xsi:nil="true"/>
+  </documentManagement>
+</p:properties>
+</file>
+
+<file path=customXml/item2.xml><?xml version="1.0" encoding="utf-8"?>
+<?mso-contentType ?>
+<FormTemplates xmlns="http://schemas.microsoft.com/sharepoint/v3/contenttype/forms">
+  <Display>DocumentLibraryForm</Display>
+  <Edit>DocumentLibraryForm</Edit>
+  <New>DocumentLibraryForm</New>
+</FormTemplates>
+</file>
+
+<file path=customXml/item3.xml><?xml version="1.0" encoding="utf-8"?>
 <ct:contentTypeSchema xmlns:ct="http://schemas.microsoft.com/office/2006/metadata/contentType" xmlns:ma="http://schemas.microsoft.com/office/2006/metadata/properties/metaAttributes" ct:_="" ma:_="" ma:contentTypeName="Document" ma:contentTypeID="0x0101009742811962FAFB4681D08D4D367296E4" ma:contentTypeVersion="10" ma:contentTypeDescription="Create a new document." ma:contentTypeScope="" ma:versionID="6f6ac22c3dc58b505e2876d4ee2b30c6">
   <xsd:schema xmlns:xsd="http://www.w3.org/2001/XMLSchema" xmlns:xs="http://www.w3.org/2001/XMLSchema" xmlns:p="http://schemas.microsoft.com/office/2006/metadata/properties" xmlns:ns3="425edb08-f8b6-435f-9340-f90897a0812f" xmlns:ns4="362643a5-cc45-448e-abe8-1482296c41e0" targetNamespace="http://schemas.microsoft.com/office/2006/metadata/properties" ma:root="true" ma:fieldsID="02873e0ff86541ce0563c4b4af75c632" ns3:_="" ns4:_="">
     <xsd:import namespace="425edb08-f8b6-435f-9340-f90897a0812f"/>
@@ -1731,24 +1835,25 @@
 </ct:contentTypeSchema>
 </file>
 
-<file path=customXml/item2.xml><?xml version="1.0" encoding="utf-8"?>
-<?mso-contentType ?>
-<FormTemplates xmlns="http://schemas.microsoft.com/sharepoint/v3/contenttype/forms">
-  <Display>DocumentLibraryForm</Display>
-  <Edit>DocumentLibraryForm</Edit>
-  <New>DocumentLibraryForm</New>
-</FormTemplates>
+<file path=customXml/itemProps1.xml><?xml version="1.0" encoding="utf-8"?>
+<ds:datastoreItem xmlns:ds="http://schemas.openxmlformats.org/officeDocument/2006/customXml" ds:itemID="{7514BA38-A11D-48A3-B8AE-217F0090DCFA}">
+  <ds:schemaRefs>
+    <ds:schemaRef ds:uri="http://schemas.microsoft.com/office/2006/metadata/properties"/>
+    <ds:schemaRef ds:uri="http://schemas.microsoft.com/office/infopath/2007/PartnerControls"/>
+    <ds:schemaRef ds:uri="425edb08-f8b6-435f-9340-f90897a0812f"/>
+  </ds:schemaRefs>
+</ds:datastoreItem>
 </file>
 
-<file path=customXml/item3.xml><?xml version="1.0" encoding="utf-8"?>
-<p:properties xmlns:p="http://schemas.microsoft.com/office/2006/metadata/properties" xmlns:xsi="http://www.w3.org/2001/XMLSchema-instance" xmlns:pc="http://schemas.microsoft.com/office/infopath/2007/PartnerControls">
-  <documentManagement>
-    <_activity xmlns="425edb08-f8b6-435f-9340-f90897a0812f" xsi:nil="true"/>
-  </documentManagement>
-</p:properties>
+<file path=customXml/itemProps2.xml><?xml version="1.0" encoding="utf-8"?>
+<ds:datastoreItem xmlns:ds="http://schemas.openxmlformats.org/officeDocument/2006/customXml" ds:itemID="{5BA11ABE-52D2-42BF-8CF5-14643B63F179}">
+  <ds:schemaRefs>
+    <ds:schemaRef ds:uri="http://schemas.microsoft.com/sharepoint/v3/contenttype/forms"/>
+  </ds:schemaRefs>
+</ds:datastoreItem>
 </file>
 
-<file path=customXml/itemProps1.xml><?xml version="1.0" encoding="utf-8"?>
+<file path=customXml/itemProps3.xml><?xml version="1.0" encoding="utf-8"?>
 <ds:datastoreItem xmlns:ds="http://schemas.openxmlformats.org/officeDocument/2006/customXml" ds:itemID="{F4B02667-9483-4525-8536-2E25173555CB}">
   <ds:schemaRefs>
     <ds:schemaRef ds:uri="http://schemas.microsoft.com/office/2006/metadata/contentType"/>
@@ -1765,22 +1870,4 @@
     <ds:schemaRef ds:uri="http://schemas.microsoft.com/internal/obd"/>
   </ds:schemaRefs>
 </ds:datastoreItem>
-</file>
-
-<file path=customXml/itemProps2.xml><?xml version="1.0" encoding="utf-8"?>
-<ds:datastoreItem xmlns:ds="http://schemas.openxmlformats.org/officeDocument/2006/customXml" ds:itemID="{5BA11ABE-52D2-42BF-8CF5-14643B63F179}">
-  <ds:schemaRefs>
-    <ds:schemaRef ds:uri="http://schemas.microsoft.com/sharepoint/v3/contenttype/forms"/>
-  </ds:schemaRefs>
-</ds:datastoreItem>
-</file>
-
-<file path=customXml/itemProps3.xml><?xml version="1.0" encoding="utf-8"?>
-<ds:datastoreItem xmlns:ds="http://schemas.openxmlformats.org/officeDocument/2006/customXml" ds:itemID="{7514BA38-A11D-48A3-B8AE-217F0090DCFA}">
-  <ds:schemaRefs>
-    <ds:schemaRef ds:uri="http://schemas.microsoft.com/office/2006/metadata/properties"/>
-    <ds:schemaRef ds:uri="http://schemas.microsoft.com/office/infopath/2007/PartnerControls"/>
-    <ds:schemaRef ds:uri="425edb08-f8b6-435f-9340-f90897a0812f"/>
-  </ds:schemaRefs>
-</ds:datastoreItem>
 </file>
</xml_diff>

<commit_message>
Quick commit before working on get_cards function, ive completed and tested all deck function and every card function except get_cards
</commit_message>
<xml_diff>
--- a/Testing for 91906.docx
+++ b/Testing for 91906.docx
@@ -258,7 +258,11 @@
           <w:tcPr>
             <w:tcW w:w="1985" w:type="dxa"/>
           </w:tcPr>
-          <w:p/>
+          <w:p>
+            <w:r>
+              <w:t>a</w:t>
+            </w:r>
+          </w:p>
         </w:tc>
         <w:tc>
           <w:tcPr>
@@ -1616,23 +1620,6 @@
 </file>
 
 <file path=customXml/item1.xml><?xml version="1.0" encoding="utf-8"?>
-<p:properties xmlns:p="http://schemas.microsoft.com/office/2006/metadata/properties" xmlns:xsi="http://www.w3.org/2001/XMLSchema-instance" xmlns:pc="http://schemas.microsoft.com/office/infopath/2007/PartnerControls">
-  <documentManagement>
-    <_activity xmlns="425edb08-f8b6-435f-9340-f90897a0812f" xsi:nil="true"/>
-  </documentManagement>
-</p:properties>
-</file>
-
-<file path=customXml/item2.xml><?xml version="1.0" encoding="utf-8"?>
-<?mso-contentType ?>
-<FormTemplates xmlns="http://schemas.microsoft.com/sharepoint/v3/contenttype/forms">
-  <Display>DocumentLibraryForm</Display>
-  <Edit>DocumentLibraryForm</Edit>
-  <New>DocumentLibraryForm</New>
-</FormTemplates>
-</file>
-
-<file path=customXml/item3.xml><?xml version="1.0" encoding="utf-8"?>
 <ct:contentTypeSchema xmlns:ct="http://schemas.microsoft.com/office/2006/metadata/contentType" xmlns:ma="http://schemas.microsoft.com/office/2006/metadata/properties/metaAttributes" ct:_="" ma:_="" ma:contentTypeName="Document" ma:contentTypeID="0x0101009742811962FAFB4681D08D4D367296E4" ma:contentTypeVersion="10" ma:contentTypeDescription="Create a new document." ma:contentTypeScope="" ma:versionID="6f6ac22c3dc58b505e2876d4ee2b30c6">
   <xsd:schema xmlns:xsd="http://www.w3.org/2001/XMLSchema" xmlns:xs="http://www.w3.org/2001/XMLSchema" xmlns:p="http://schemas.microsoft.com/office/2006/metadata/properties" xmlns:ns3="425edb08-f8b6-435f-9340-f90897a0812f" xmlns:ns4="362643a5-cc45-448e-abe8-1482296c41e0" targetNamespace="http://schemas.microsoft.com/office/2006/metadata/properties" ma:root="true" ma:fieldsID="02873e0ff86541ce0563c4b4af75c632" ns3:_="" ns4:_="">
     <xsd:import namespace="425edb08-f8b6-435f-9340-f90897a0812f"/>
@@ -1835,25 +1822,24 @@
 </ct:contentTypeSchema>
 </file>
 
-<file path=customXml/itemProps1.xml><?xml version="1.0" encoding="utf-8"?>
-<ds:datastoreItem xmlns:ds="http://schemas.openxmlformats.org/officeDocument/2006/customXml" ds:itemID="{7514BA38-A11D-48A3-B8AE-217F0090DCFA}">
-  <ds:schemaRefs>
-    <ds:schemaRef ds:uri="http://schemas.microsoft.com/office/2006/metadata/properties"/>
-    <ds:schemaRef ds:uri="http://schemas.microsoft.com/office/infopath/2007/PartnerControls"/>
-    <ds:schemaRef ds:uri="425edb08-f8b6-435f-9340-f90897a0812f"/>
-  </ds:schemaRefs>
-</ds:datastoreItem>
+<file path=customXml/item2.xml><?xml version="1.0" encoding="utf-8"?>
+<?mso-contentType ?>
+<FormTemplates xmlns="http://schemas.microsoft.com/sharepoint/v3/contenttype/forms">
+  <Display>DocumentLibraryForm</Display>
+  <Edit>DocumentLibraryForm</Edit>
+  <New>DocumentLibraryForm</New>
+</FormTemplates>
 </file>
 
-<file path=customXml/itemProps2.xml><?xml version="1.0" encoding="utf-8"?>
-<ds:datastoreItem xmlns:ds="http://schemas.openxmlformats.org/officeDocument/2006/customXml" ds:itemID="{5BA11ABE-52D2-42BF-8CF5-14643B63F179}">
-  <ds:schemaRefs>
-    <ds:schemaRef ds:uri="http://schemas.microsoft.com/sharepoint/v3/contenttype/forms"/>
-  </ds:schemaRefs>
-</ds:datastoreItem>
+<file path=customXml/item3.xml><?xml version="1.0" encoding="utf-8"?>
+<p:properties xmlns:p="http://schemas.microsoft.com/office/2006/metadata/properties" xmlns:xsi="http://www.w3.org/2001/XMLSchema-instance" xmlns:pc="http://schemas.microsoft.com/office/infopath/2007/PartnerControls">
+  <documentManagement>
+    <_activity xmlns="425edb08-f8b6-435f-9340-f90897a0812f" xsi:nil="true"/>
+  </documentManagement>
+</p:properties>
 </file>
 
-<file path=customXml/itemProps3.xml><?xml version="1.0" encoding="utf-8"?>
+<file path=customXml/itemProps1.xml><?xml version="1.0" encoding="utf-8"?>
 <ds:datastoreItem xmlns:ds="http://schemas.openxmlformats.org/officeDocument/2006/customXml" ds:itemID="{F4B02667-9483-4525-8536-2E25173555CB}">
   <ds:schemaRefs>
     <ds:schemaRef ds:uri="http://schemas.microsoft.com/office/2006/metadata/contentType"/>
@@ -1870,4 +1856,22 @@
     <ds:schemaRef ds:uri="http://schemas.microsoft.com/internal/obd"/>
   </ds:schemaRefs>
 </ds:datastoreItem>
+</file>
+
+<file path=customXml/itemProps2.xml><?xml version="1.0" encoding="utf-8"?>
+<ds:datastoreItem xmlns:ds="http://schemas.openxmlformats.org/officeDocument/2006/customXml" ds:itemID="{5BA11ABE-52D2-42BF-8CF5-14643B63F179}">
+  <ds:schemaRefs>
+    <ds:schemaRef ds:uri="http://schemas.microsoft.com/sharepoint/v3/contenttype/forms"/>
+  </ds:schemaRefs>
+</ds:datastoreItem>
+</file>
+
+<file path=customXml/itemProps3.xml><?xml version="1.0" encoding="utf-8"?>
+<ds:datastoreItem xmlns:ds="http://schemas.openxmlformats.org/officeDocument/2006/customXml" ds:itemID="{7514BA38-A11D-48A3-B8AE-217F0090DCFA}">
+  <ds:schemaRefs>
+    <ds:schemaRef ds:uri="http://schemas.microsoft.com/office/2006/metadata/properties"/>
+    <ds:schemaRef ds:uri="http://schemas.microsoft.com/office/infopath/2007/PartnerControls"/>
+    <ds:schemaRef ds:uri="425edb08-f8b6-435f-9340-f90897a0812f"/>
+  </ds:schemaRefs>
+</ds:datastoreItem>
 </file>
</xml_diff>